<commit_message>
Add medium-report.md for flowchart rendering tests and documentation
- Introduced a new report focusing on the rendering of flowcharts using Mermaid.
- Documented the purpose of the report, including observations on multi-line labels and HTML handling.
- Included a detailed Mermaid diagram illustrating the internal architecture of the flowchart parser and renderer.
- Added a TypeScript function to assert that multi-line labels are not truncated after scaling.
- Outlined steps for manual verification of the rendered output in Word.
</commit_message>
<xml_diff>
--- a/packages/vscode-extension/docs/demo-full.docx
+++ b/packages/vscode-extension/docs/demo-full.docx
@@ -1381,14 +1381,14 @@
     <w:rPrDefault>
       <w:rPr>
         <w:rFonts w:asciiTheme="minorHAnsi" w:cstheme="minorBidi" w:eastAsiaTheme="minorHAnsi" w:hAnsiTheme="minorHAnsi"/>
-        <w:sz w:val="24"/>
-        <w:szCs w:val="24"/>
+        <w:sz w:val="22"/>
+        <w:szCs w:val="22"/>
         <w:lang w:bidi="ar-SA" w:eastAsia="en-US" w:val="en-US"/>
       </w:rPr>
     </w:rPrDefault>
     <w:pPrDefault>
       <w:pPr>
-        <w:spacing w:after="200"/>
+        <w:spacing w:after="160" w:line="259" w:lineRule="auto"/>
       </w:pPr>
     </w:pPrDefault>
   </w:docDefaults>
@@ -1435,7 +1435,7 @@
       <w:rFonts w:asciiTheme="majorHAnsi" w:cstheme="majorBidi" w:eastAsiaTheme="majorEastAsia" w:hAnsiTheme="majorHAnsi"/>
       <w:b/>
       <w:bCs/>
-      <w:color w:themeColor="accent1" w:themeShade="B5" w:val="345A8A"/>
+      <w:color w:themeColor="accent1" w:themeShade="B5" w:val="2E5395"/>
       <w:sz w:val="36"/>
       <w:szCs w:val="36"/>
     </w:rPr>
@@ -1491,7 +1491,7 @@
       <w:sz w:val="20"/>
       <w:szCs w:val="20"/>
       <w:b/>
-      <w:color w:val="345A8A"/>
+      <w:color w:val="2E5395"/>
       &gt;
     </w:rPr>
   </w:style>
@@ -1532,9 +1532,7 @@
     </w:pPr>
     <w:rPr>
       <w:rFonts w:asciiTheme="majorHAnsi" w:cstheme="majorBidi" w:eastAsiaTheme="majorEastAsia" w:hAnsiTheme="majorHAnsi"/>
-      <w:b/>
-      <w:bCs/>
-      <w:color w:themeColor="accent1" w:val="4F81BD"/>
+      <w:color w:themeColor="accent1" w:val="4472C4"/>
       <w:sz w:val="32"/>
       <w:szCs w:val="32"/>
     </w:rPr>
@@ -1554,9 +1552,7 @@
     </w:pPr>
     <w:rPr>
       <w:rFonts w:asciiTheme="majorHAnsi" w:cstheme="majorBidi" w:eastAsiaTheme="majorEastAsia" w:hAnsiTheme="majorHAnsi"/>
-      <w:b/>
-      <w:bCs/>
-      <w:color w:themeColor="accent1" w:val="4F81BD"/>
+      <w:color w:themeColor="accent1" w:val="4472C4"/>
       <w:sz w:val="28"/>
       <w:szCs w:val="28"/>
     </w:rPr>
@@ -1576,9 +1572,7 @@
     </w:pPr>
     <w:rPr>
       <w:rFonts w:asciiTheme="majorHAnsi" w:cstheme="majorBidi" w:eastAsiaTheme="majorEastAsia" w:hAnsiTheme="majorHAnsi"/>
-      <w:b/>
-      <w:bCs/>
-      <w:color w:themeColor="accent1" w:val="4F81BD"/>
+      <w:color w:themeColor="accent1" w:val="4472C4"/>
       <w:sz w:val="24"/>
       <w:szCs w:val="24"/>
     </w:rPr>
@@ -1598,9 +1592,7 @@
     </w:pPr>
     <w:rPr>
       <w:rFonts w:asciiTheme="majorHAnsi" w:cstheme="majorBidi" w:eastAsiaTheme="majorEastAsia" w:hAnsiTheme="majorHAnsi"/>
-      <w:i/>
-      <w:bCs/>
-      <w:color w:themeColor="accent1" w:val="4F81BD"/>
+      <w:color w:themeColor="accent1" w:val="4472C4"/>
       <w:sz w:val="24"/>
       <w:szCs w:val="24"/>
     </w:rPr>
@@ -1620,8 +1612,7 @@
     </w:pPr>
     <w:rPr>
       <w:rFonts w:asciiTheme="majorHAnsi" w:cstheme="majorBidi" w:eastAsiaTheme="majorEastAsia" w:hAnsiTheme="majorHAnsi"/>
-      <w:iCs/>
-      <w:color w:themeColor="accent1" w:val="4F81BD"/>
+      <w:color w:themeColor="accent1" w:val="4472C4"/>
       <w:sz w:val="24"/>
       <w:szCs w:val="24"/>
     </w:rPr>
@@ -1641,7 +1632,7 @@
     </w:pPr>
     <w:rPr>
       <w:rFonts w:asciiTheme="majorHAnsi" w:cstheme="majorBidi" w:eastAsiaTheme="majorEastAsia" w:hAnsiTheme="majorHAnsi"/>
-      <w:color w:themeColor="accent1" w:val="4F81BD"/>
+      <w:color w:themeColor="accent1" w:val="4472C4"/>
       <w:sz w:val="24"/>
       <w:szCs w:val="24"/>
     </w:rPr>
@@ -1661,7 +1652,7 @@
     </w:pPr>
     <w:rPr>
       <w:rFonts w:asciiTheme="majorHAnsi" w:cstheme="majorBidi" w:eastAsiaTheme="majorEastAsia" w:hAnsiTheme="majorHAnsi"/>
-      <w:color w:themeColor="accent1" w:val="4F81BD"/>
+      <w:color w:themeColor="accent1" w:val="4472C4"/>
       <w:sz w:val="24"/>
       <w:szCs w:val="24"/>
     </w:rPr>
@@ -1681,7 +1672,7 @@
     </w:pPr>
     <w:rPr>
       <w:rFonts w:asciiTheme="majorHAnsi" w:cstheme="majorBidi" w:eastAsiaTheme="majorEastAsia" w:hAnsiTheme="majorHAnsi"/>
-      <w:color w:themeColor="accent1" w:val="4F81BD"/>
+      <w:color w:themeColor="accent1" w:val="4472C4"/>
       <w:sz w:val="24"/>
       <w:szCs w:val="24"/>
     </w:rPr>
@@ -1701,7 +1692,7 @@
     </w:pPr>
     <w:rPr>
       <w:rFonts w:asciiTheme="majorHAnsi" w:cstheme="majorBidi" w:eastAsiaTheme="majorEastAsia" w:hAnsiTheme="majorHAnsi"/>
-      <w:color w:themeColor="accent1" w:val="4F81BD"/>
+      <w:color w:themeColor="accent1" w:val="4472C4"/>
       <w:sz w:val="24"/>
       <w:szCs w:val="24"/>
     </w:rPr>
@@ -1840,7 +1831,7 @@
     <w:name w:val="Hyperlink"/>
     <w:basedOn w:val="BodyTextChar"/>
     <w:rPr>
-      <w:color w:themeColor="accent1" w:val="4F81BD"/>
+      <w:color w:themeColor="accent1" w:val="4472C4"/>
     </w:rPr>
   </w:style>
   <w:style w:styleId="TOCHeading" w:type="paragraph">
@@ -2109,39 +2100,39 @@
         <a:sysClr val="window" lastClr="FFFFFF"/>
       </a:lt1>
       <a:dk2>
-        <a:srgbClr val="1F497D"/>
+        <a:srgbClr val="44546A"/>
       </a:dk2>
       <a:lt2>
-        <a:srgbClr val="EEECE1"/>
+        <a:srgbClr val="E7E6E6"/>
       </a:lt2>
       <a:accent1>
-        <a:srgbClr val="4F81BD"/>
+        <a:srgbClr val="4472C4"/>
       </a:accent1>
       <a:accent2>
-        <a:srgbClr val="C0504D"/>
+        <a:srgbClr val="ED7D31"/>
       </a:accent2>
       <a:accent3>
-        <a:srgbClr val="9BBB59"/>
+        <a:srgbClr val="A5A5A5"/>
       </a:accent3>
       <a:accent4>
-        <a:srgbClr val="8064A2"/>
+        <a:srgbClr val="FFC000"/>
       </a:accent4>
       <a:accent5>
-        <a:srgbClr val="4BACC6"/>
+        <a:srgbClr val="5B9BD5"/>
       </a:accent5>
       <a:accent6>
-        <a:srgbClr val="F79646"/>
+        <a:srgbClr val="70AD47"/>
       </a:accent6>
       <a:hlink>
-        <a:srgbClr val="0000FF"/>
+        <a:srgbClr val="0563C1"/>
       </a:hlink>
       <a:folHlink>
-        <a:srgbClr val="800080"/>
+        <a:srgbClr val="954F72"/>
       </a:folHlink>
     </a:clrScheme>
     <a:fontScheme name="Office">
       <a:majorFont>
-        <a:latin typeface="Calibri"/>
+        <a:latin typeface="Aptos Display"/>
         <a:ea typeface=""/>
         <a:cs typeface=""/>
         <a:font script="Jpan" typeface="ＭＳ ゴシック"/>
@@ -2175,7 +2166,7 @@
         <a:font script="Uigh" typeface="Microsoft Uighur"/>
       </a:majorFont>
       <a:minorFont>
-        <a:latin typeface="Cambria"/>
+        <a:latin typeface="Aptos"/>
         <a:ea typeface=""/>
         <a:cs typeface=""/>
         <a:font script="Jpan" typeface="ＭＳ 明朝"/>

</xml_diff>